<commit_message>
content(personal): one resume for the site and for applications
- resume.json now holds the application CV of 2026-10-22 word for word, in
  the compact density with its GDPR footnote, so the PDF the site offers, the
  printer sheet and the CV sent with applications are the same document.
- history/2026-10-22: the PDF is a byte copy of the build; the DOCX is
  converted from resume.json; the Markdown conversion is unchanged.

Co-Authored-By: Claude Opus 5.5 <noreply@anthropic.com>
Claude-Session: https://claude.ai/code/session_01DCFUuTFB7pf1faESEV8AQ5
</commit_message>
<xml_diff>
--- a/content/resume/history/2026-10-22/Liu_Zhong_Li_CV_2026-10-22.docx
+++ b/content/resume/history/2026-10-22/Liu_Zhong_Li_CV_2026-10-22.docx
@@ -126,7 +126,7 @@
               <w:spacing w:line="226" w:lineRule="exact"/>
               <w:jc w:val="right"/>
             </w:pPr>
-            <w:hyperlink w:history="1" r:id="rIdac-sz7w-amksa827pfkl1">
+            <w:hyperlink w:history="1" r:id="rIdxijgvtpovmds93wg3pedq">
               <w:r>
                 <w:rPr>
                   <w:rFonts w:ascii="Arial" w:cs="Arial" w:eastAsia="Arial" w:hAnsi="Arial"/>
@@ -148,7 +148,7 @@
               </w:rPr>
               <w:t xml:space="preserve">  •  </w:t>
             </w:r>
-            <w:hyperlink w:history="1" r:id="rId5wo3zuviztzfkqg0t9kuk">
+            <w:hyperlink w:history="1" r:id="rId0g8u3zndxvmdq0g6_mcl3">
               <w:r>
                 <w:rPr>
                   <w:rFonts w:ascii="Arial" w:cs="Arial" w:eastAsia="Arial" w:hAnsi="Arial"/>
@@ -170,7 +170,7 @@
               </w:rPr>
               <w:t xml:space="preserve">  •  </w:t>
             </w:r>
-            <w:hyperlink w:history="1" r:id="rIdjhimnbiu0w_flac6oy_zt">
+            <w:hyperlink w:history="1" r:id="rIdtx9eifetikkmuksocsdgl">
               <w:r>
                 <w:rPr>
                   <w:rFonts w:ascii="Arial" w:cs="Arial" w:eastAsia="Arial" w:hAnsi="Arial"/>
@@ -192,7 +192,7 @@
               </w:rPr>
               <w:t xml:space="preserve">  •  </w:t>
             </w:r>
-            <w:hyperlink w:history="1" r:id="rIdswkihzmb4upu5c8xc6eks">
+            <w:hyperlink w:history="1" r:id="rIdik68kmvgqkkubhvxzoraj">
               <w:r>
                 <w:rPr>
                   <w:rFonts w:ascii="Arial" w:cs="Arial" w:eastAsia="Arial" w:hAnsi="Arial"/>
@@ -247,7 +247,7 @@
           <w:sz w:val="17"/>
           <w:szCs w:val="17"/>
         </w:rPr>
-        <w:t xml:space="preserve">Sviluppatore full-stack con esperienza professionale nello sviluppo di applicazioni web e mobile, principalmente con C#/.NET (ASP.NET Core, Entity Framework Core), React/Next.js, Flutter, SQL Server e PostgreSQL. Da dicembre 2025 sviluppo in autonomia Crew, dalla UX/UI al cloud fino alla pubblicazione su Google Play e App Store.</w:t>
+        <w:t xml:space="preserve">Sviluppatore full-stack con esperienza professionale nello sviluppo di applicazioni web e mobile, principalmente con C#/.NET (ASP.NET Core, Entity Framework Core), React/Next.js, Flutter, SQL Server e PostgreSQL. Da dicembre 2025 sviluppo in autonomia Crew, dalla UX/UI al cloud fino alla pubblicazione su Google Play e App Store.</w:t>
       </w:r>
     </w:p>
     <w:p>
@@ -313,7 +313,7 @@
         <w:keepNext/>
         <w:spacing w:line="226" w:lineRule="exact"/>
       </w:pPr>
-      <w:hyperlink w:history="1" r:id="rIdkjsoi_vo8va6mot7ktmow">
+      <w:hyperlink w:history="1" r:id="rIdbcvg9f8jef34-bjk3j_um">
         <w:r>
           <w:rPr>
             <w:rFonts w:ascii="Arial" w:cs="Arial" w:eastAsia="Arial" w:hAnsi="Arial"/>
@@ -335,7 +335,7 @@
         </w:rPr>
         <w:t xml:space="preserve">  •  </w:t>
       </w:r>
-      <w:hyperlink w:history="1" r:id="rId5b80xohjljywwpmjpr4xg">
+      <w:hyperlink w:history="1" r:id="rIdahbqiumgdlwsoqwrf-ui1">
         <w:r>
           <w:rPr>
             <w:rFonts w:ascii="Arial" w:cs="Arial" w:eastAsia="Arial" w:hAnsi="Arial"/>
@@ -357,7 +357,7 @@
         </w:rPr>
         <w:t xml:space="preserve">  •  </w:t>
       </w:r>
-      <w:hyperlink w:history="1" r:id="rId4sruk3dcfnhfb_nd3prg_">
+      <w:hyperlink w:history="1" r:id="rIdz-3a4h4ogamr2n_tfwco4">
         <w:r>
           <w:rPr>
             <w:rFonts w:ascii="Arial" w:cs="Arial" w:eastAsia="Arial" w:hAnsi="Arial"/>
@@ -409,7 +409,7 @@
           <w:sz w:val="16"/>
           <w:szCs w:val="16"/>
         </w:rPr>
-        <w:t xml:space="preserve">Progettazione e sviluppo end-to-end: UX/UI, backend ASP.NET Core con Entity Framework Core, app Flutter, sito web e pannello di amministrazione in Next.js, database PostgreSQL/PostGIS.</w:t>
+        <w:t xml:space="preserve">Progettazione e sviluppo end-to-end: UX/UI, backend ASP.NET Core con Entity Framework Core, app Flutter, sito web e pannello di amministrazione in Next.js, database PostgreSQL/PostGIS.</w:t>
       </w:r>
     </w:p>
     <w:p>
@@ -766,7 +766,7 @@
         </w:tabs>
         <w:spacing w:line="250" w:lineRule="exact"/>
       </w:pPr>
-      <w:hyperlink w:history="1" r:id="rIdelmu4vlhkxblloiksoajo">
+      <w:hyperlink w:history="1" r:id="rId85fmq0aftbwovnm__vegs">
         <w:r>
           <w:rPr>
             <w:rFonts w:ascii="Arial" w:cs="Arial" w:eastAsia="Arial" w:hAnsi="Arial"/>
@@ -857,7 +857,7 @@
         </w:tabs>
         <w:spacing w:line="250" w:lineRule="exact"/>
       </w:pPr>
-      <w:hyperlink w:history="1" r:id="rIdcvxc0mbz14yc3vgll31vt">
+      <w:hyperlink w:history="1" r:id="rIdgipbdw20mix2buw7bdpdt">
         <w:r>
           <w:rPr>
             <w:rFonts w:ascii="Arial" w:cs="Arial" w:eastAsia="Arial" w:hAnsi="Arial"/>

</xml_diff>